<commit_message>
wordnet notes modified and notebook created.
</commit_message>
<xml_diff>
--- a/NLP/WordNet_Notes.docx
+++ b/NLP/WordNet_Notes.docx
@@ -47,26 +47,7 @@
           <w:sz w:val="40"/>
           <w:szCs w:val="40"/>
         </w:rPr>
-        <w:t>Complete Student Notes</w:t>
-      </w:r>
-    </w:p>
-    <w:p>
-      <w:pPr>
-        <w:pStyle w:val="Normal"/>
-        <w:spacing w:before="0" w:after="200"/>
-        <w:jc w:val="center"/>
-        <w:rPr/>
-      </w:pPr>
-      <w:r>
-        <w:rPr>
-          <w:rFonts w:eastAsia="Arial" w:cs="Arial"/>
-          <w:i/>
-          <w:iCs/>
-          <w:color w:val="555555"/>
-          <w:sz w:val="26"/>
-          <w:szCs w:val="26"/>
-        </w:rPr>
-        <w:t>From Zero to Expert — All Concepts Explained with Code</w:t>
+        <w:t>Complete Notes</w:t>
       </w:r>
     </w:p>
     <w:p>
@@ -135,7 +116,7 @@
       </w:pPr>
       <w:r>
         <w:rPr>
-          <w:rFonts w:eastAsia="Arial" w:cs="Arial" w:ascii="Arial" w:hAnsi="Arial"/>
+          <w:rFonts w:eastAsia="Arial" w:cs="Arial"/>
           <w:b/>
           <w:bCs/>
           <w:color w:val="FFFFFF"/>
@@ -146,7 +127,7 @@
       </w:r>
       <w:r>
         <w:rPr>
-          <w:rFonts w:eastAsia="Arial" w:cs="Arial" w:ascii="Arial" w:hAnsi="Arial"/>
+          <w:rFonts w:eastAsia="Arial" w:cs="Arial"/>
           <w:b/>
           <w:bCs/>
           <w:color w:val="FFFFFF"/>
@@ -491,7 +472,7 @@
       </w:pPr>
       <w:r>
         <w:rPr>
-          <w:rFonts w:eastAsia="Arial" w:cs="Arial" w:ascii="Arial" w:hAnsi="Arial"/>
+          <w:rFonts w:eastAsia="Arial" w:cs="Arial"/>
           <w:b/>
           <w:bCs/>
           <w:color w:val="FFFFFF"/>
@@ -785,7 +766,7 @@
       </w:pPr>
       <w:r>
         <w:rPr>
-          <w:rFonts w:eastAsia="Arial" w:cs="Arial" w:ascii="Arial" w:hAnsi="Arial"/>
+          <w:rFonts w:eastAsia="Arial" w:cs="Arial"/>
           <w:b/>
           <w:bCs/>
           <w:color w:val="1F4E79"/>
@@ -816,7 +797,7 @@
         <w:pStyle w:val="ListParagraph"/>
         <w:numPr>
           <w:ilvl w:val="0"/>
-          <w:numId w:val="3"/>
+          <w:numId w:val="4"/>
         </w:numPr>
         <w:spacing w:before="60" w:after="60"/>
         <w:rPr/>
@@ -847,7 +828,7 @@
         <w:pStyle w:val="ListParagraph"/>
         <w:numPr>
           <w:ilvl w:val="0"/>
-          <w:numId w:val="1"/>
+          <w:numId w:val="2"/>
         </w:numPr>
         <w:spacing w:before="60" w:after="60"/>
         <w:rPr/>
@@ -878,7 +859,7 @@
         <w:pStyle w:val="ListParagraph"/>
         <w:numPr>
           <w:ilvl w:val="0"/>
-          <w:numId w:val="1"/>
+          <w:numId w:val="2"/>
         </w:numPr>
         <w:spacing w:before="60" w:after="60"/>
         <w:rPr/>
@@ -909,7 +890,7 @@
         <w:pStyle w:val="ListParagraph"/>
         <w:numPr>
           <w:ilvl w:val="0"/>
-          <w:numId w:val="1"/>
+          <w:numId w:val="2"/>
         </w:numPr>
         <w:spacing w:before="60" w:after="60"/>
         <w:rPr/>
@@ -940,7 +921,7 @@
         <w:pStyle w:val="ListParagraph"/>
         <w:numPr>
           <w:ilvl w:val="0"/>
-          <w:numId w:val="1"/>
+          <w:numId w:val="2"/>
         </w:numPr>
         <w:spacing w:before="60" w:after="60"/>
         <w:rPr/>
@@ -987,7 +968,7 @@
       </w:pPr>
       <w:r>
         <w:rPr>
-          <w:rFonts w:eastAsia="Arial" w:cs="Arial" w:ascii="Arial" w:hAnsi="Arial"/>
+          <w:rFonts w:eastAsia="Arial" w:cs="Arial"/>
           <w:b/>
           <w:bCs/>
           <w:color w:val="1F4E79"/>
@@ -1102,7 +1083,7 @@
       </w:pPr>
       <w:r>
         <w:rPr>
-          <w:rFonts w:eastAsia="Arial" w:cs="Arial" w:ascii="Arial" w:hAnsi="Arial"/>
+          <w:rFonts w:eastAsia="Arial" w:cs="Arial"/>
           <w:b/>
           <w:bCs/>
           <w:color w:val="FFFFFF"/>
@@ -1133,7 +1114,7 @@
       </w:pPr>
       <w:r>
         <w:rPr>
-          <w:rFonts w:eastAsia="Arial" w:cs="Arial" w:ascii="Arial" w:hAnsi="Arial"/>
+          <w:rFonts w:eastAsia="Arial" w:cs="Arial"/>
           <w:b/>
           <w:bCs/>
           <w:color w:val="1F4E79"/>
@@ -1182,7 +1163,7 @@
       </w:pPr>
       <w:r>
         <w:rPr>
-          <w:rFonts w:eastAsia="Arial" w:cs="Arial" w:ascii="Arial" w:hAnsi="Arial"/>
+          <w:rFonts w:eastAsia="Arial" w:cs="Arial"/>
           <w:b/>
           <w:bCs/>
           <w:color w:val="1F4E79"/>
@@ -1321,7 +1302,7 @@
       </w:pPr>
       <w:r>
         <w:rPr>
-          <w:rFonts w:eastAsia="Arial" w:cs="Arial" w:ascii="Arial" w:hAnsi="Arial"/>
+          <w:rFonts w:eastAsia="Arial" w:cs="Arial"/>
           <w:b/>
           <w:bCs/>
           <w:color w:val="1F4E79"/>
@@ -1643,7 +1624,7 @@
       </w:pPr>
       <w:r>
         <w:rPr>
-          <w:rFonts w:eastAsia="Arial" w:cs="Arial" w:ascii="Arial" w:hAnsi="Arial"/>
+          <w:rFonts w:eastAsia="Arial" w:cs="Arial"/>
           <w:b/>
           <w:bCs/>
           <w:color w:val="FFFFFF"/>
@@ -1703,14 +1684,14 @@
         </w:tblCellMar>
       </w:tblPr>
       <w:tblGrid>
-        <w:gridCol w:w="1799"/>
-        <w:gridCol w:w="7561"/>
+        <w:gridCol w:w="1798"/>
+        <w:gridCol w:w="7562"/>
       </w:tblGrid>
       <w:tr>
         <w:trPr/>
         <w:tc>
           <w:tcPr>
-            <w:tcW w:w="1799" w:type="dxa"/>
+            <w:tcW w:w="1798" w:type="dxa"/>
             <w:tcBorders>
               <w:top w:val="single" w:sz="2" w:space="0" w:color="BBBBBB"/>
               <w:start w:val="single" w:sz="2" w:space="0" w:color="BBBBBB"/>
@@ -1741,7 +1722,7 @@
         </w:tc>
         <w:tc>
           <w:tcPr>
-            <w:tcW w:w="7561" w:type="dxa"/>
+            <w:tcW w:w="7562" w:type="dxa"/>
             <w:tcBorders>
               <w:top w:val="single" w:sz="2" w:space="0" w:color="BBBBBB"/>
               <w:start w:val="single" w:sz="2" w:space="0" w:color="BBBBBB"/>
@@ -1795,14 +1776,14 @@
         </w:tblCellMar>
       </w:tblPr>
       <w:tblGrid>
-        <w:gridCol w:w="1799"/>
-        <w:gridCol w:w="7561"/>
+        <w:gridCol w:w="1798"/>
+        <w:gridCol w:w="7562"/>
       </w:tblGrid>
       <w:tr>
         <w:trPr/>
         <w:tc>
           <w:tcPr>
-            <w:tcW w:w="1799" w:type="dxa"/>
+            <w:tcW w:w="1798" w:type="dxa"/>
             <w:tcBorders>
               <w:top w:val="single" w:sz="2" w:space="0" w:color="BBBBBB"/>
               <w:start w:val="single" w:sz="2" w:space="0" w:color="BBBBBB"/>
@@ -1833,7 +1814,7 @@
         </w:tc>
         <w:tc>
           <w:tcPr>
-            <w:tcW w:w="7561" w:type="dxa"/>
+            <w:tcW w:w="7562" w:type="dxa"/>
             <w:tcBorders>
               <w:top w:val="single" w:sz="2" w:space="0" w:color="BBBBBB"/>
               <w:start w:val="single" w:sz="2" w:space="0" w:color="BBBBBB"/>
@@ -1887,14 +1868,14 @@
         </w:tblCellMar>
       </w:tblPr>
       <w:tblGrid>
-        <w:gridCol w:w="1799"/>
-        <w:gridCol w:w="7561"/>
+        <w:gridCol w:w="1798"/>
+        <w:gridCol w:w="7562"/>
       </w:tblGrid>
       <w:tr>
         <w:trPr/>
         <w:tc>
           <w:tcPr>
-            <w:tcW w:w="1799" w:type="dxa"/>
+            <w:tcW w:w="1798" w:type="dxa"/>
             <w:tcBorders>
               <w:top w:val="single" w:sz="2" w:space="0" w:color="BBBBBB"/>
               <w:start w:val="single" w:sz="2" w:space="0" w:color="BBBBBB"/>
@@ -1925,7 +1906,7 @@
         </w:tc>
         <w:tc>
           <w:tcPr>
-            <w:tcW w:w="7561" w:type="dxa"/>
+            <w:tcW w:w="7562" w:type="dxa"/>
             <w:tcBorders>
               <w:top w:val="single" w:sz="2" w:space="0" w:color="BBBBBB"/>
               <w:start w:val="single" w:sz="2" w:space="0" w:color="BBBBBB"/>
@@ -1979,14 +1960,14 @@
         </w:tblCellMar>
       </w:tblPr>
       <w:tblGrid>
-        <w:gridCol w:w="1799"/>
-        <w:gridCol w:w="7561"/>
+        <w:gridCol w:w="1798"/>
+        <w:gridCol w:w="7562"/>
       </w:tblGrid>
       <w:tr>
         <w:trPr/>
         <w:tc>
           <w:tcPr>
-            <w:tcW w:w="1799" w:type="dxa"/>
+            <w:tcW w:w="1798" w:type="dxa"/>
             <w:tcBorders>
               <w:top w:val="single" w:sz="2" w:space="0" w:color="BBBBBB"/>
               <w:start w:val="single" w:sz="2" w:space="0" w:color="BBBBBB"/>
@@ -2017,7 +1998,7 @@
         </w:tc>
         <w:tc>
           <w:tcPr>
-            <w:tcW w:w="7561" w:type="dxa"/>
+            <w:tcW w:w="7562" w:type="dxa"/>
             <w:tcBorders>
               <w:top w:val="single" w:sz="2" w:space="0" w:color="BBBBBB"/>
               <w:start w:val="single" w:sz="2" w:space="0" w:color="BBBBBB"/>
@@ -2041,16 +2022,7 @@
                 <w:sz w:val="22"/>
                 <w:szCs w:val="22"/>
               </w:rPr>
-              <w:t xml:space="preserve">A specific word inside a specific synset. It represents one word-sense pairing. </w:t>
-            </w:r>
-            <w:r>
-              <w:rPr>
-                <w:rFonts w:eastAsia="Arial" w:cs="Arial"/>
-                <w:color w:val="1A1A1A"/>
-                <w:sz w:val="22"/>
-                <w:szCs w:val="22"/>
-              </w:rPr>
-              <w:t>E.g., Lemma('dog.n.01.domestic_dog')</w:t>
+              <w:t>A specific word inside a specific synset. It represents one word-sense pairing. E.g., Lemma('dog.n.01.domestic_dog')</w:t>
             </w:r>
           </w:p>
         </w:tc>
@@ -2080,14 +2052,14 @@
         </w:tblCellMar>
       </w:tblPr>
       <w:tblGrid>
-        <w:gridCol w:w="1799"/>
-        <w:gridCol w:w="7561"/>
+        <w:gridCol w:w="1798"/>
+        <w:gridCol w:w="7562"/>
       </w:tblGrid>
       <w:tr>
         <w:trPr/>
         <w:tc>
           <w:tcPr>
-            <w:tcW w:w="1799" w:type="dxa"/>
+            <w:tcW w:w="1798" w:type="dxa"/>
             <w:tcBorders>
               <w:top w:val="single" w:sz="2" w:space="0" w:color="BBBBBB"/>
               <w:start w:val="single" w:sz="2" w:space="0" w:color="BBBBBB"/>
@@ -2118,7 +2090,7 @@
         </w:tc>
         <w:tc>
           <w:tcPr>
-            <w:tcW w:w="7561" w:type="dxa"/>
+            <w:tcW w:w="7562" w:type="dxa"/>
             <w:tcBorders>
               <w:top w:val="single" w:sz="2" w:space="0" w:color="BBBBBB"/>
               <w:start w:val="single" w:sz="2" w:space="0" w:color="BBBBBB"/>
@@ -2172,14 +2144,14 @@
         </w:tblCellMar>
       </w:tblPr>
       <w:tblGrid>
-        <w:gridCol w:w="1799"/>
-        <w:gridCol w:w="7561"/>
+        <w:gridCol w:w="1798"/>
+        <w:gridCol w:w="7562"/>
       </w:tblGrid>
       <w:tr>
         <w:trPr/>
         <w:tc>
           <w:tcPr>
-            <w:tcW w:w="1799" w:type="dxa"/>
+            <w:tcW w:w="1798" w:type="dxa"/>
             <w:tcBorders>
               <w:top w:val="single" w:sz="2" w:space="0" w:color="BBBBBB"/>
               <w:start w:val="single" w:sz="2" w:space="0" w:color="BBBBBB"/>
@@ -2210,7 +2182,7 @@
         </w:tc>
         <w:tc>
           <w:tcPr>
-            <w:tcW w:w="7561" w:type="dxa"/>
+            <w:tcW w:w="7562" w:type="dxa"/>
             <w:tcBorders>
               <w:top w:val="single" w:sz="2" w:space="0" w:color="BBBBBB"/>
               <w:start w:val="single" w:sz="2" w:space="0" w:color="BBBBBB"/>
@@ -2284,14 +2256,14 @@
         </w:tblCellMar>
       </w:tblPr>
       <w:tblGrid>
-        <w:gridCol w:w="1799"/>
-        <w:gridCol w:w="7561"/>
+        <w:gridCol w:w="1798"/>
+        <w:gridCol w:w="7562"/>
       </w:tblGrid>
       <w:tr>
         <w:trPr/>
         <w:tc>
           <w:tcPr>
-            <w:tcW w:w="1799" w:type="dxa"/>
+            <w:tcW w:w="1798" w:type="dxa"/>
             <w:tcBorders>
               <w:top w:val="single" w:sz="2" w:space="0" w:color="BBBBBB"/>
               <w:start w:val="single" w:sz="2" w:space="0" w:color="BBBBBB"/>
@@ -2322,7 +2294,7 @@
         </w:tc>
         <w:tc>
           <w:tcPr>
-            <w:tcW w:w="7561" w:type="dxa"/>
+            <w:tcW w:w="7562" w:type="dxa"/>
             <w:tcBorders>
               <w:top w:val="single" w:sz="2" w:space="0" w:color="BBBBBB"/>
               <w:start w:val="single" w:sz="2" w:space="0" w:color="BBBBBB"/>
@@ -2387,14 +2359,14 @@
         </w:tblCellMar>
       </w:tblPr>
       <w:tblGrid>
-        <w:gridCol w:w="1799"/>
-        <w:gridCol w:w="7561"/>
+        <w:gridCol w:w="1798"/>
+        <w:gridCol w:w="7562"/>
       </w:tblGrid>
       <w:tr>
         <w:trPr/>
         <w:tc>
           <w:tcPr>
-            <w:tcW w:w="1799" w:type="dxa"/>
+            <w:tcW w:w="1798" w:type="dxa"/>
             <w:tcBorders>
               <w:top w:val="single" w:sz="2" w:space="0" w:color="BBBBBB"/>
               <w:start w:val="single" w:sz="2" w:space="0" w:color="BBBBBB"/>
@@ -2425,7 +2397,7 @@
         </w:tc>
         <w:tc>
           <w:tcPr>
-            <w:tcW w:w="7561" w:type="dxa"/>
+            <w:tcW w:w="7562" w:type="dxa"/>
             <w:tcBorders>
               <w:top w:val="single" w:sz="2" w:space="0" w:color="BBBBBB"/>
               <w:start w:val="single" w:sz="2" w:space="0" w:color="BBBBBB"/>
@@ -2460,29 +2432,7 @@
                 <w:sz w:val="22"/>
                 <w:szCs w:val="22"/>
               </w:rPr>
-              <w:t>`</w:t>
-            </w:r>
-            <w:r>
-              <w:rPr>
-                <w:rFonts w:eastAsia="Arial" w:cs="Arial"/>
-                <w:b/>
-                <w:bCs/>
-                <w:color w:val="1A1A1A"/>
-                <w:sz w:val="22"/>
-                <w:szCs w:val="22"/>
-              </w:rPr>
-              <w:t>dogs are part of a pack</w:t>
-            </w:r>
-            <w:r>
-              <w:rPr>
-                <w:rFonts w:eastAsia="Arial" w:cs="Arial"/>
-                <w:b/>
-                <w:bCs/>
-                <w:color w:val="1A1A1A"/>
-                <w:sz w:val="22"/>
-                <w:szCs w:val="22"/>
-              </w:rPr>
-              <w:t>`</w:t>
+              <w:t>`dogs are part of a pack`</w:t>
             </w:r>
             <w:r>
               <w:rPr>
@@ -2521,14 +2471,14 @@
         </w:tblCellMar>
       </w:tblPr>
       <w:tblGrid>
-        <w:gridCol w:w="1799"/>
-        <w:gridCol w:w="7561"/>
+        <w:gridCol w:w="1798"/>
+        <w:gridCol w:w="7562"/>
       </w:tblGrid>
       <w:tr>
         <w:trPr/>
         <w:tc>
           <w:tcPr>
-            <w:tcW w:w="1799" w:type="dxa"/>
+            <w:tcW w:w="1798" w:type="dxa"/>
             <w:tcBorders>
               <w:top w:val="single" w:sz="2" w:space="0" w:color="BBBBBB"/>
               <w:start w:val="single" w:sz="2" w:space="0" w:color="BBBBBB"/>
@@ -2559,7 +2509,7 @@
         </w:tc>
         <w:tc>
           <w:tcPr>
-            <w:tcW w:w="7561" w:type="dxa"/>
+            <w:tcW w:w="7562" w:type="dxa"/>
             <w:tcBorders>
               <w:top w:val="single" w:sz="2" w:space="0" w:color="BBBBBB"/>
               <w:start w:val="single" w:sz="2" w:space="0" w:color="BBBBBB"/>
@@ -2613,14 +2563,14 @@
         </w:tblCellMar>
       </w:tblPr>
       <w:tblGrid>
-        <w:gridCol w:w="1799"/>
-        <w:gridCol w:w="7561"/>
+        <w:gridCol w:w="1798"/>
+        <w:gridCol w:w="7562"/>
       </w:tblGrid>
       <w:tr>
         <w:trPr/>
         <w:tc>
           <w:tcPr>
-            <w:tcW w:w="1799" w:type="dxa"/>
+            <w:tcW w:w="1798" w:type="dxa"/>
             <w:tcBorders>
               <w:top w:val="single" w:sz="2" w:space="0" w:color="BBBBBB"/>
               <w:start w:val="single" w:sz="2" w:space="0" w:color="BBBBBB"/>
@@ -2651,7 +2601,7 @@
         </w:tc>
         <w:tc>
           <w:tcPr>
-            <w:tcW w:w="7561" w:type="dxa"/>
+            <w:tcW w:w="7562" w:type="dxa"/>
             <w:tcBorders>
               <w:top w:val="single" w:sz="2" w:space="0" w:color="BBBBBB"/>
               <w:start w:val="single" w:sz="2" w:space="0" w:color="BBBBBB"/>
@@ -2709,7 +2659,7 @@
       </w:pPr>
       <w:r>
         <w:rPr>
-          <w:rFonts w:eastAsia="Arial" w:cs="Arial" w:ascii="Arial" w:hAnsi="Arial"/>
+          <w:rFonts w:eastAsia="Arial" w:cs="Arial"/>
           <w:b/>
           <w:bCs/>
           <w:color w:val="1F4E79"/>
@@ -2727,7 +2677,7 @@
         <w:pBdr>
           <w:bottom w:val="single" w:sz="4" w:space="0" w:color="2E86C1"/>
         </w:pBdr>
-        <w:spacing w:before="300" w:after="160"/>
+        <w:spacing w:before="0" w:after="160"/>
         <w:rPr>
           <w:rFonts w:ascii="Arial" w:hAnsi="Arial" w:eastAsia="Arial" w:cs="Arial"/>
           <w:b/>
@@ -2739,7 +2689,7 @@
       </w:pPr>
       <w:r>
         <w:rPr>
-          <w:rFonts w:eastAsia="Arial" w:cs="Arial" w:ascii="Arial" w:hAnsi="Arial"/>
+          <w:rFonts w:eastAsia="Arial" w:cs="Arial"/>
           <w:b/>
           <w:bCs/>
           <w:color w:val="1F4E79"/>
@@ -3482,7 +3432,7 @@
       </w:pPr>
       <w:r>
         <w:rPr>
-          <w:rFonts w:eastAsia="Arial" w:cs="Arial" w:ascii="Arial" w:hAnsi="Arial"/>
+          <w:rFonts w:eastAsia="Arial" w:cs="Arial"/>
           <w:b/>
           <w:bCs/>
           <w:color w:val="FFFFFF"/>
@@ -3550,7 +3500,7 @@
       </w:pPr>
       <w:r>
         <w:rPr>
-          <w:rFonts w:eastAsia="Arial" w:cs="Arial" w:ascii="Arial" w:hAnsi="Arial"/>
+          <w:rFonts w:eastAsia="Arial" w:cs="Arial"/>
           <w:b/>
           <w:bCs/>
           <w:color w:val="1F4E79"/>
@@ -3783,7 +3733,7 @@
       </w:pPr>
       <w:r>
         <w:rPr>
-          <w:rFonts w:eastAsia="Arial" w:cs="Arial" w:ascii="Arial" w:hAnsi="Arial"/>
+          <w:rFonts w:eastAsia="Arial" w:cs="Arial"/>
           <w:b/>
           <w:bCs/>
           <w:color w:val="1F4E79"/>
@@ -4066,7 +4016,7 @@
       </w:pPr>
       <w:r>
         <w:rPr>
-          <w:rFonts w:eastAsia="Arial" w:cs="Arial" w:ascii="Arial" w:hAnsi="Arial"/>
+          <w:rFonts w:eastAsia="Arial" w:cs="Arial"/>
           <w:b/>
           <w:bCs/>
           <w:color w:val="1F4E79"/>
@@ -4631,7 +4581,7 @@
       </w:pPr>
       <w:r>
         <w:rPr>
-          <w:rFonts w:eastAsia="Arial" w:cs="Arial" w:ascii="Arial" w:hAnsi="Arial"/>
+          <w:rFonts w:eastAsia="Arial" w:cs="Arial"/>
           <w:b/>
           <w:bCs/>
           <w:color w:val="1F4E79"/>
@@ -5073,7 +5023,7 @@
       </w:pPr>
       <w:r>
         <w:rPr>
-          <w:rFonts w:eastAsia="Arial" w:cs="Arial" w:ascii="Arial" w:hAnsi="Arial"/>
+          <w:rFonts w:eastAsia="Arial" w:cs="Arial"/>
           <w:b/>
           <w:bCs/>
           <w:color w:val="FFFFFF"/>
@@ -5364,7 +5314,7 @@
       </w:pPr>
       <w:r>
         <w:rPr>
-          <w:rFonts w:eastAsia="Arial" w:cs="Arial" w:ascii="Arial" w:hAnsi="Arial"/>
+          <w:rFonts w:eastAsia="Arial" w:cs="Arial"/>
           <w:b/>
           <w:bCs/>
           <w:color w:val="1F4E79"/>
@@ -5648,7 +5598,7 @@
       </w:pPr>
       <w:r>
         <w:rPr>
-          <w:rFonts w:eastAsia="Arial" w:cs="Arial" w:ascii="Arial" w:hAnsi="Arial"/>
+          <w:rFonts w:eastAsia="Arial" w:cs="Arial"/>
           <w:b/>
           <w:bCs/>
           <w:color w:val="1F4E79"/>
@@ -5666,7 +5616,7 @@
         <w:pBdr>
           <w:bottom w:val="single" w:sz="4" w:space="0" w:color="2E86C1"/>
         </w:pBdr>
-        <w:spacing w:before="300" w:after="160"/>
+        <w:spacing w:before="0" w:after="160"/>
         <w:rPr>
           <w:rFonts w:ascii="Arial" w:hAnsi="Arial" w:eastAsia="Arial" w:cs="Arial"/>
           <w:b/>
@@ -5678,7 +5628,7 @@
       </w:pPr>
       <w:r>
         <w:rPr>
-          <w:rFonts w:eastAsia="Arial" w:cs="Arial" w:ascii="Arial" w:hAnsi="Arial"/>
+          <w:rFonts w:eastAsia="Arial" w:cs="Arial"/>
           <w:b/>
           <w:bCs/>
           <w:color w:val="1F4E79"/>
@@ -5696,7 +5646,7 @@
         <w:pBdr>
           <w:bottom w:val="single" w:sz="4" w:space="0" w:color="2E86C1"/>
         </w:pBdr>
-        <w:spacing w:before="300" w:after="160"/>
+        <w:spacing w:before="0" w:after="160"/>
         <w:rPr>
           <w:rFonts w:ascii="Arial" w:hAnsi="Arial" w:eastAsia="Arial" w:cs="Arial"/>
           <w:b/>
@@ -5708,7 +5658,7 @@
       </w:pPr>
       <w:r>
         <w:rPr>
-          <w:rFonts w:eastAsia="Arial" w:cs="Arial" w:ascii="Arial" w:hAnsi="Arial"/>
+          <w:rFonts w:eastAsia="Arial" w:cs="Arial"/>
           <w:b/>
           <w:bCs/>
           <w:color w:val="1F4E79"/>
@@ -6092,15 +6042,15 @@
         </w:tblCellMar>
       </w:tblPr>
       <w:tblGrid>
-        <w:gridCol w:w="2799"/>
+        <w:gridCol w:w="2798"/>
         <w:gridCol w:w="3200"/>
-        <w:gridCol w:w="3361"/>
+        <w:gridCol w:w="3362"/>
       </w:tblGrid>
       <w:tr>
         <w:trPr/>
         <w:tc>
           <w:tcPr>
-            <w:tcW w:w="2799" w:type="dxa"/>
+            <w:tcW w:w="2798" w:type="dxa"/>
             <w:tcBorders>
               <w:top w:val="single" w:sz="2" w:space="0" w:color="BBBBBB"/>
               <w:start w:val="single" w:sz="2" w:space="0" w:color="BBBBBB"/>
@@ -6158,7 +6108,7 @@
         </w:tc>
         <w:tc>
           <w:tcPr>
-            <w:tcW w:w="3361" w:type="dxa"/>
+            <w:tcW w:w="3362" w:type="dxa"/>
             <w:tcBorders>
               <w:top w:val="single" w:sz="2" w:space="0" w:color="BBBBBB"/>
               <w:start w:val="single" w:sz="2" w:space="0" w:color="BBBBBB"/>
@@ -6190,7 +6140,7 @@
         <w:trPr/>
         <w:tc>
           <w:tcPr>
-            <w:tcW w:w="2799" w:type="dxa"/>
+            <w:tcW w:w="2798" w:type="dxa"/>
             <w:tcBorders>
               <w:top w:val="single" w:sz="2" w:space="0" w:color="BBBBBB"/>
               <w:start w:val="single" w:sz="2" w:space="0" w:color="BBBBBB"/>
@@ -6244,7 +6194,7 @@
         </w:tc>
         <w:tc>
           <w:tcPr>
-            <w:tcW w:w="3361" w:type="dxa"/>
+            <w:tcW w:w="3362" w:type="dxa"/>
             <w:tcBorders>
               <w:top w:val="single" w:sz="2" w:space="0" w:color="BBBBBB"/>
               <w:start w:val="single" w:sz="2" w:space="0" w:color="BBBBBB"/>
@@ -6274,7 +6224,7 @@
         <w:trPr/>
         <w:tc>
           <w:tcPr>
-            <w:tcW w:w="2799" w:type="dxa"/>
+            <w:tcW w:w="2798" w:type="dxa"/>
             <w:tcBorders>
               <w:top w:val="single" w:sz="2" w:space="0" w:color="BBBBBB"/>
               <w:start w:val="single" w:sz="2" w:space="0" w:color="BBBBBB"/>
@@ -6328,7 +6278,7 @@
         </w:tc>
         <w:tc>
           <w:tcPr>
-            <w:tcW w:w="3361" w:type="dxa"/>
+            <w:tcW w:w="3362" w:type="dxa"/>
             <w:tcBorders>
               <w:top w:val="single" w:sz="2" w:space="0" w:color="BBBBBB"/>
               <w:start w:val="single" w:sz="2" w:space="0" w:color="BBBBBB"/>
@@ -6358,7 +6308,7 @@
         <w:trPr/>
         <w:tc>
           <w:tcPr>
-            <w:tcW w:w="2799" w:type="dxa"/>
+            <w:tcW w:w="2798" w:type="dxa"/>
             <w:tcBorders>
               <w:top w:val="single" w:sz="2" w:space="0" w:color="BBBBBB"/>
               <w:start w:val="single" w:sz="2" w:space="0" w:color="BBBBBB"/>
@@ -6412,7 +6362,7 @@
         </w:tc>
         <w:tc>
           <w:tcPr>
-            <w:tcW w:w="3361" w:type="dxa"/>
+            <w:tcW w:w="3362" w:type="dxa"/>
             <w:tcBorders>
               <w:top w:val="single" w:sz="2" w:space="0" w:color="BBBBBB"/>
               <w:start w:val="single" w:sz="2" w:space="0" w:color="BBBBBB"/>
@@ -6464,7 +6414,7 @@
       </w:pPr>
       <w:r>
         <w:rPr>
-          <w:rFonts w:eastAsia="Arial" w:cs="Arial" w:ascii="Arial" w:hAnsi="Arial"/>
+          <w:rFonts w:eastAsia="Arial" w:cs="Arial"/>
           <w:b/>
           <w:bCs/>
           <w:color w:val="FFFFFF"/>
@@ -6521,7 +6471,7 @@
       </w:pPr>
       <w:r>
         <w:rPr>
-          <w:rFonts w:eastAsia="Arial" w:cs="Arial" w:ascii="Arial" w:hAnsi="Arial"/>
+          <w:rFonts w:eastAsia="Arial" w:cs="Arial"/>
           <w:b/>
           <w:bCs/>
           <w:color w:val="1F4E79"/>
@@ -6886,7 +6836,7 @@
       </w:pPr>
       <w:r>
         <w:rPr>
-          <w:rFonts w:eastAsia="Arial" w:cs="Arial" w:ascii="Arial" w:hAnsi="Arial"/>
+          <w:rFonts w:eastAsia="Arial" w:cs="Arial"/>
           <w:b/>
           <w:bCs/>
           <w:color w:val="1F4E79"/>
@@ -7374,7 +7324,7 @@
       </w:pPr>
       <w:r>
         <w:rPr>
-          <w:rFonts w:eastAsia="Arial" w:cs="Arial" w:ascii="Arial" w:hAnsi="Arial"/>
+          <w:rFonts w:eastAsia="Arial" w:cs="Arial"/>
           <w:b/>
           <w:bCs/>
           <w:color w:val="1F4E79"/>
@@ -7700,7 +7650,7 @@
       </w:pPr>
       <w:r>
         <w:rPr>
-          <w:rFonts w:eastAsia="Arial" w:cs="Arial" w:ascii="Arial" w:hAnsi="Arial"/>
+          <w:rFonts w:eastAsia="Arial" w:cs="Arial"/>
           <w:b/>
           <w:bCs/>
           <w:color w:val="1F4E79"/>
@@ -7922,25 +7872,7 @@
           <w:sz w:val="20"/>
           <w:szCs w:val="20"/>
         </w:rPr>
-        <w:t>print(</w:t>
-      </w:r>
-      <w:r>
-        <w:rPr>
-          <w:rFonts w:eastAsia="Courier New" w:cs="Courier New" w:ascii="Courier New" w:hAnsi="Courier New"/>
-          <w:color w:val="D4D4D4"/>
-          <w:sz w:val="20"/>
-          <w:szCs w:val="20"/>
-        </w:rPr>
-        <w:t>man</w:t>
-      </w:r>
-      <w:r>
-        <w:rPr>
-          <w:rFonts w:eastAsia="Courier New" w:cs="Courier New" w:ascii="Courier New" w:hAnsi="Courier New"/>
-          <w:color w:val="D4D4D4"/>
-          <w:sz w:val="20"/>
-          <w:szCs w:val="20"/>
-        </w:rPr>
-        <w:t>.lowest_common_hypernyms(woman))</w:t>
+        <w:t>print(man.lowest_common_hypernyms(woman))</w:t>
       </w:r>
     </w:p>
     <w:p>
@@ -7988,34 +7920,7 @@
           <w:sz w:val="20"/>
           <w:szCs w:val="20"/>
         </w:rPr>
-        <w:t>[Synset('</w:t>
-      </w:r>
-      <w:r>
-        <w:rPr>
-          <w:rFonts w:eastAsia="Courier New" w:cs="Courier New" w:ascii="Courier New" w:hAnsi="Courier New"/>
-          <w:color w:val="1A5276"/>
-          <w:sz w:val="20"/>
-          <w:szCs w:val="20"/>
-        </w:rPr>
-        <w:t>adult</w:t>
-      </w:r>
-      <w:r>
-        <w:rPr>
-          <w:rFonts w:eastAsia="Courier New" w:cs="Courier New" w:ascii="Courier New" w:hAnsi="Courier New"/>
-          <w:color w:val="1A5276"/>
-          <w:sz w:val="20"/>
-          <w:szCs w:val="20"/>
-        </w:rPr>
-        <w:t xml:space="preserve">.n.01')]    # both are </w:t>
-      </w:r>
-      <w:r>
-        <w:rPr>
-          <w:rFonts w:eastAsia="Courier New" w:cs="Courier New" w:ascii="Courier New" w:hAnsi="Courier New"/>
-          <w:color w:val="1A5276"/>
-          <w:sz w:val="20"/>
-          <w:szCs w:val="20"/>
-        </w:rPr>
-        <w:t>adults</w:t>
+        <w:t>[Synset('adult.n.01')]    # both are adults</w:t>
       </w:r>
     </w:p>
     <w:p>
@@ -8039,7 +7944,7 @@
       </w:pPr>
       <w:r>
         <w:rPr>
-          <w:rFonts w:eastAsia="Arial" w:cs="Arial" w:ascii="Arial" w:hAnsi="Arial"/>
+          <w:rFonts w:eastAsia="Arial" w:cs="Arial"/>
           <w:b/>
           <w:bCs/>
           <w:color w:val="1F4E79"/>
@@ -8073,7 +7978,6 @@
           <w:rPr>
             <w:rStyle w:val="Hyperlink"/>
             <w:rFonts w:eastAsia="Arial" w:cs="Arial"/>
-            <w:b/>
             <w:b/>
             <w:bCs/>
             <w:color w:val="1A1A1A"/>
@@ -8097,7 +8001,6 @@
           <w:rPr>
             <w:rStyle w:val="Hyperlink"/>
             <w:rFonts w:eastAsia="Arial" w:cs="Arial"/>
-            <w:b/>
             <w:b/>
             <w:bCs/>
             <w:color w:val="1A1A1A"/>
@@ -8422,15 +8325,15 @@
         </w:tblCellMar>
       </w:tblPr>
       <w:tblGrid>
-        <w:gridCol w:w="2399"/>
-        <w:gridCol w:w="3361"/>
+        <w:gridCol w:w="2398"/>
+        <w:gridCol w:w="3362"/>
         <w:gridCol w:w="3600"/>
       </w:tblGrid>
       <w:tr>
         <w:trPr/>
         <w:tc>
           <w:tcPr>
-            <w:tcW w:w="2399" w:type="dxa"/>
+            <w:tcW w:w="2398" w:type="dxa"/>
             <w:tcBorders>
               <w:top w:val="single" w:sz="2" w:space="0" w:color="BBBBBB"/>
               <w:start w:val="single" w:sz="2" w:space="0" w:color="BBBBBB"/>
@@ -8459,7 +8362,7 @@
         </w:tc>
         <w:tc>
           <w:tcPr>
-            <w:tcW w:w="3361" w:type="dxa"/>
+            <w:tcW w:w="3362" w:type="dxa"/>
             <w:tcBorders>
               <w:top w:val="single" w:sz="2" w:space="0" w:color="BBBBBB"/>
               <w:start w:val="single" w:sz="2" w:space="0" w:color="BBBBBB"/>
@@ -8520,7 +8423,7 @@
         <w:trPr/>
         <w:tc>
           <w:tcPr>
-            <w:tcW w:w="2399" w:type="dxa"/>
+            <w:tcW w:w="2398" w:type="dxa"/>
             <w:tcBorders>
               <w:top w:val="single" w:sz="2" w:space="0" w:color="BBBBBB"/>
               <w:start w:val="single" w:sz="2" w:space="0" w:color="BBBBBB"/>
@@ -8551,7 +8454,7 @@
         </w:tc>
         <w:tc>
           <w:tcPr>
-            <w:tcW w:w="3361" w:type="dxa"/>
+            <w:tcW w:w="3362" w:type="dxa"/>
             <w:tcBorders>
               <w:top w:val="single" w:sz="2" w:space="0" w:color="BBBBBB"/>
               <w:start w:val="single" w:sz="2" w:space="0" w:color="BBBBBB"/>
@@ -8616,7 +8519,7 @@
         <w:trPr/>
         <w:tc>
           <w:tcPr>
-            <w:tcW w:w="2399" w:type="dxa"/>
+            <w:tcW w:w="2398" w:type="dxa"/>
             <w:tcBorders>
               <w:top w:val="single" w:sz="2" w:space="0" w:color="BBBBBB"/>
               <w:start w:val="single" w:sz="2" w:space="0" w:color="BBBBBB"/>
@@ -8647,7 +8550,7 @@
         </w:tc>
         <w:tc>
           <w:tcPr>
-            <w:tcW w:w="3361" w:type="dxa"/>
+            <w:tcW w:w="3362" w:type="dxa"/>
             <w:tcBorders>
               <w:top w:val="single" w:sz="2" w:space="0" w:color="BBBBBB"/>
               <w:start w:val="single" w:sz="2" w:space="0" w:color="BBBBBB"/>
@@ -8712,7 +8615,7 @@
         <w:trPr/>
         <w:tc>
           <w:tcPr>
-            <w:tcW w:w="2399" w:type="dxa"/>
+            <w:tcW w:w="2398" w:type="dxa"/>
             <w:tcBorders>
               <w:top w:val="single" w:sz="2" w:space="0" w:color="BBBBBB"/>
               <w:start w:val="single" w:sz="2" w:space="0" w:color="BBBBBB"/>
@@ -8743,7 +8646,7 @@
         </w:tc>
         <w:tc>
           <w:tcPr>
-            <w:tcW w:w="3361" w:type="dxa"/>
+            <w:tcW w:w="3362" w:type="dxa"/>
             <w:tcBorders>
               <w:top w:val="single" w:sz="2" w:space="0" w:color="BBBBBB"/>
               <w:start w:val="single" w:sz="2" w:space="0" w:color="BBBBBB"/>
@@ -8808,7 +8711,7 @@
         <w:trPr/>
         <w:tc>
           <w:tcPr>
-            <w:tcW w:w="2399" w:type="dxa"/>
+            <w:tcW w:w="2398" w:type="dxa"/>
             <w:tcBorders>
               <w:top w:val="single" w:sz="2" w:space="0" w:color="BBBBBB"/>
               <w:start w:val="single" w:sz="2" w:space="0" w:color="BBBBBB"/>
@@ -8839,7 +8742,7 @@
         </w:tc>
         <w:tc>
           <w:tcPr>
-            <w:tcW w:w="3361" w:type="dxa"/>
+            <w:tcW w:w="3362" w:type="dxa"/>
             <w:tcBorders>
               <w:top w:val="single" w:sz="2" w:space="0" w:color="BBBBBB"/>
               <w:start w:val="single" w:sz="2" w:space="0" w:color="BBBBBB"/>
@@ -8904,7 +8807,7 @@
         <w:trPr/>
         <w:tc>
           <w:tcPr>
-            <w:tcW w:w="2399" w:type="dxa"/>
+            <w:tcW w:w="2398" w:type="dxa"/>
             <w:tcBorders>
               <w:top w:val="single" w:sz="2" w:space="0" w:color="BBBBBB"/>
               <w:start w:val="single" w:sz="2" w:space="0" w:color="BBBBBB"/>
@@ -8935,7 +8838,7 @@
         </w:tc>
         <w:tc>
           <w:tcPr>
-            <w:tcW w:w="3361" w:type="dxa"/>
+            <w:tcW w:w="3362" w:type="dxa"/>
             <w:tcBorders>
               <w:top w:val="single" w:sz="2" w:space="0" w:color="BBBBBB"/>
               <w:start w:val="single" w:sz="2" w:space="0" w:color="BBBBBB"/>
@@ -9000,7 +8903,7 @@
         <w:trPr/>
         <w:tc>
           <w:tcPr>
-            <w:tcW w:w="2399" w:type="dxa"/>
+            <w:tcW w:w="2398" w:type="dxa"/>
             <w:tcBorders>
               <w:top w:val="single" w:sz="2" w:space="0" w:color="BBBBBB"/>
               <w:start w:val="single" w:sz="2" w:space="0" w:color="BBBBBB"/>
@@ -9031,7 +8934,7 @@
         </w:tc>
         <w:tc>
           <w:tcPr>
-            <w:tcW w:w="3361" w:type="dxa"/>
+            <w:tcW w:w="3362" w:type="dxa"/>
             <w:tcBorders>
               <w:top w:val="single" w:sz="2" w:space="0" w:color="BBBBBB"/>
               <w:start w:val="single" w:sz="2" w:space="0" w:color="BBBBBB"/>
@@ -9096,7 +8999,7 @@
         <w:trPr/>
         <w:tc>
           <w:tcPr>
-            <w:tcW w:w="2399" w:type="dxa"/>
+            <w:tcW w:w="2398" w:type="dxa"/>
             <w:tcBorders>
               <w:top w:val="single" w:sz="2" w:space="0" w:color="BBBBBB"/>
               <w:start w:val="single" w:sz="2" w:space="0" w:color="BBBBBB"/>
@@ -9127,7 +9030,7 @@
         </w:tc>
         <w:tc>
           <w:tcPr>
-            <w:tcW w:w="3361" w:type="dxa"/>
+            <w:tcW w:w="3362" w:type="dxa"/>
             <w:tcBorders>
               <w:top w:val="single" w:sz="2" w:space="0" w:color="BBBBBB"/>
               <w:start w:val="single" w:sz="2" w:space="0" w:color="BBBBBB"/>
@@ -9192,7 +9095,7 @@
         <w:trPr/>
         <w:tc>
           <w:tcPr>
-            <w:tcW w:w="2399" w:type="dxa"/>
+            <w:tcW w:w="2398" w:type="dxa"/>
             <w:tcBorders>
               <w:top w:val="single" w:sz="2" w:space="0" w:color="BBBBBB"/>
               <w:start w:val="single" w:sz="2" w:space="0" w:color="BBBBBB"/>
@@ -9223,7 +9126,7 @@
         </w:tc>
         <w:tc>
           <w:tcPr>
-            <w:tcW w:w="3361" w:type="dxa"/>
+            <w:tcW w:w="3362" w:type="dxa"/>
             <w:tcBorders>
               <w:top w:val="single" w:sz="2" w:space="0" w:color="BBBBBB"/>
               <w:start w:val="single" w:sz="2" w:space="0" w:color="BBBBBB"/>
@@ -9288,7 +9191,7 @@
         <w:trPr/>
         <w:tc>
           <w:tcPr>
-            <w:tcW w:w="2399" w:type="dxa"/>
+            <w:tcW w:w="2398" w:type="dxa"/>
             <w:tcBorders>
               <w:top w:val="single" w:sz="2" w:space="0" w:color="BBBBBB"/>
               <w:start w:val="single" w:sz="2" w:space="0" w:color="BBBBBB"/>
@@ -9319,7 +9222,7 @@
         </w:tc>
         <w:tc>
           <w:tcPr>
-            <w:tcW w:w="3361" w:type="dxa"/>
+            <w:tcW w:w="3362" w:type="dxa"/>
             <w:tcBorders>
               <w:top w:val="single" w:sz="2" w:space="0" w:color="BBBBBB"/>
               <w:start w:val="single" w:sz="2" w:space="0" w:color="BBBBBB"/>
@@ -9384,7 +9287,7 @@
         <w:trPr/>
         <w:tc>
           <w:tcPr>
-            <w:tcW w:w="2399" w:type="dxa"/>
+            <w:tcW w:w="2398" w:type="dxa"/>
             <w:tcBorders>
               <w:top w:val="single" w:sz="2" w:space="0" w:color="BBBBBB"/>
               <w:start w:val="single" w:sz="2" w:space="0" w:color="BBBBBB"/>
@@ -9415,7 +9318,7 @@
         </w:tc>
         <w:tc>
           <w:tcPr>
-            <w:tcW w:w="3361" w:type="dxa"/>
+            <w:tcW w:w="3362" w:type="dxa"/>
             <w:tcBorders>
               <w:top w:val="single" w:sz="2" w:space="0" w:color="BBBBBB"/>
               <w:start w:val="single" w:sz="2" w:space="0" w:color="BBBBBB"/>
@@ -9480,7 +9383,7 @@
         <w:trPr/>
         <w:tc>
           <w:tcPr>
-            <w:tcW w:w="2399" w:type="dxa"/>
+            <w:tcW w:w="2398" w:type="dxa"/>
             <w:tcBorders>
               <w:top w:val="single" w:sz="2" w:space="0" w:color="BBBBBB"/>
               <w:start w:val="single" w:sz="2" w:space="0" w:color="BBBBBB"/>
@@ -9511,7 +9414,7 @@
         </w:tc>
         <w:tc>
           <w:tcPr>
-            <w:tcW w:w="3361" w:type="dxa"/>
+            <w:tcW w:w="3362" w:type="dxa"/>
             <w:tcBorders>
               <w:top w:val="single" w:sz="2" w:space="0" w:color="BBBBBB"/>
               <w:start w:val="single" w:sz="2" w:space="0" w:color="BBBBBB"/>
@@ -9598,7 +9501,7 @@
       </w:pPr>
       <w:r>
         <w:rPr>
-          <w:rFonts w:eastAsia="Arial" w:cs="Arial" w:ascii="Arial" w:hAnsi="Arial"/>
+          <w:rFonts w:eastAsia="Arial" w:cs="Arial"/>
           <w:b/>
           <w:bCs/>
           <w:color w:val="FFFFFF"/>
@@ -10062,7 +9965,7 @@
       </w:pPr>
       <w:r>
         <w:rPr>
-          <w:rFonts w:eastAsia="Arial" w:cs="Arial" w:ascii="Arial" w:hAnsi="Arial"/>
+          <w:rFonts w:eastAsia="Arial" w:cs="Arial"/>
           <w:b/>
           <w:bCs/>
           <w:color w:val="1F4E79"/>
@@ -10378,7 +10281,7 @@
       </w:pPr>
       <w:r>
         <w:rPr>
-          <w:rFonts w:eastAsia="Arial" w:cs="Arial" w:ascii="Arial" w:hAnsi="Arial"/>
+          <w:rFonts w:eastAsia="Arial" w:cs="Arial"/>
           <w:b/>
           <w:bCs/>
           <w:color w:val="1F4E79"/>
@@ -10553,7 +10456,7 @@
       </w:pPr>
       <w:r>
         <w:rPr>
-          <w:rFonts w:eastAsia="Arial" w:cs="Arial" w:ascii="Arial" w:hAnsi="Arial"/>
+          <w:rFonts w:eastAsia="Arial" w:cs="Arial"/>
           <w:b/>
           <w:bCs/>
           <w:color w:val="1F4E79"/>
@@ -10728,7 +10631,7 @@
       </w:pPr>
       <w:r>
         <w:rPr>
-          <w:rFonts w:eastAsia="Arial" w:cs="Arial" w:ascii="Arial" w:hAnsi="Arial"/>
+          <w:rFonts w:eastAsia="Arial" w:cs="Arial"/>
           <w:b/>
           <w:bCs/>
           <w:color w:val="1F4E79"/>
@@ -10792,7 +10695,7 @@
       </w:pPr>
       <w:r>
         <w:rPr>
-          <w:rFonts w:eastAsia="Arial" w:cs="Arial" w:ascii="Arial" w:hAnsi="Arial"/>
+          <w:rFonts w:eastAsia="Arial" w:cs="Arial"/>
           <w:b/>
           <w:bCs/>
           <w:color w:val="2E86C1"/>
@@ -10917,7 +10820,7 @@
       </w:pPr>
       <w:r>
         <w:rPr>
-          <w:rFonts w:eastAsia="Arial" w:cs="Arial" w:ascii="Arial" w:hAnsi="Arial"/>
+          <w:rFonts w:eastAsia="Arial" w:cs="Arial"/>
           <w:b/>
           <w:bCs/>
           <w:color w:val="2E86C1"/>
@@ -11006,7 +10909,7 @@
       </w:pPr>
       <w:r>
         <w:rPr>
-          <w:rFonts w:eastAsia="Arial" w:cs="Arial" w:ascii="Arial" w:hAnsi="Arial"/>
+          <w:rFonts w:eastAsia="Arial" w:cs="Arial"/>
           <w:b/>
           <w:bCs/>
           <w:color w:val="2E86C1"/>
@@ -11107,7 +11010,7 @@
       </w:pPr>
       <w:r>
         <w:rPr>
-          <w:rFonts w:eastAsia="Arial" w:cs="Arial" w:ascii="Arial" w:hAnsi="Arial"/>
+          <w:rFonts w:eastAsia="Arial" w:cs="Arial"/>
           <w:b/>
           <w:bCs/>
           <w:color w:val="1F4E79"/>
@@ -11132,8 +11035,8 @@
       </w:tblPr>
       <w:tblGrid>
         <w:gridCol w:w="2000"/>
-        <w:gridCol w:w="2199"/>
-        <w:gridCol w:w="1680"/>
+        <w:gridCol w:w="2198"/>
+        <w:gridCol w:w="1681"/>
         <w:gridCol w:w="1681"/>
         <w:gridCol w:w="1800"/>
       </w:tblGrid>
@@ -11170,7 +11073,7 @@
         </w:tc>
         <w:tc>
           <w:tcPr>
-            <w:tcW w:w="2199" w:type="dxa"/>
+            <w:tcW w:w="2198" w:type="dxa"/>
             <w:tcBorders>
               <w:top w:val="single" w:sz="2" w:space="0" w:color="BBBBBB"/>
               <w:start w:val="single" w:sz="2" w:space="0" w:color="BBBBBB"/>
@@ -11199,7 +11102,7 @@
         </w:tc>
         <w:tc>
           <w:tcPr>
-            <w:tcW w:w="1680" w:type="dxa"/>
+            <w:tcW w:w="1681" w:type="dxa"/>
             <w:tcBorders>
               <w:top w:val="single" w:sz="2" w:space="0" w:color="BBBBBB"/>
               <w:start w:val="single" w:sz="2" w:space="0" w:color="BBBBBB"/>
@@ -11320,7 +11223,7 @@
         </w:tc>
         <w:tc>
           <w:tcPr>
-            <w:tcW w:w="2199" w:type="dxa"/>
+            <w:tcW w:w="2198" w:type="dxa"/>
             <w:tcBorders>
               <w:top w:val="single" w:sz="2" w:space="0" w:color="BBBBBB"/>
               <w:start w:val="single" w:sz="2" w:space="0" w:color="BBBBBB"/>
@@ -11351,7 +11254,7 @@
         </w:tc>
         <w:tc>
           <w:tcPr>
-            <w:tcW w:w="1680" w:type="dxa"/>
+            <w:tcW w:w="1681" w:type="dxa"/>
             <w:tcBorders>
               <w:top w:val="single" w:sz="2" w:space="0" w:color="BBBBBB"/>
               <w:start w:val="single" w:sz="2" w:space="0" w:color="BBBBBB"/>
@@ -11478,7 +11381,7 @@
         </w:tc>
         <w:tc>
           <w:tcPr>
-            <w:tcW w:w="2199" w:type="dxa"/>
+            <w:tcW w:w="2198" w:type="dxa"/>
             <w:tcBorders>
               <w:top w:val="single" w:sz="2" w:space="0" w:color="BBBBBB"/>
               <w:start w:val="single" w:sz="2" w:space="0" w:color="BBBBBB"/>
@@ -11509,7 +11412,7 @@
         </w:tc>
         <w:tc>
           <w:tcPr>
-            <w:tcW w:w="1680" w:type="dxa"/>
+            <w:tcW w:w="1681" w:type="dxa"/>
             <w:tcBorders>
               <w:top w:val="single" w:sz="2" w:space="0" w:color="BBBBBB"/>
               <w:start w:val="single" w:sz="2" w:space="0" w:color="BBBBBB"/>
@@ -11636,7 +11539,7 @@
         </w:tc>
         <w:tc>
           <w:tcPr>
-            <w:tcW w:w="2199" w:type="dxa"/>
+            <w:tcW w:w="2198" w:type="dxa"/>
             <w:tcBorders>
               <w:top w:val="single" w:sz="2" w:space="0" w:color="BBBBBB"/>
               <w:start w:val="single" w:sz="2" w:space="0" w:color="BBBBBB"/>
@@ -11667,7 +11570,7 @@
         </w:tc>
         <w:tc>
           <w:tcPr>
-            <w:tcW w:w="1680" w:type="dxa"/>
+            <w:tcW w:w="1681" w:type="dxa"/>
             <w:tcBorders>
               <w:top w:val="single" w:sz="2" w:space="0" w:color="BBBBBB"/>
               <w:start w:val="single" w:sz="2" w:space="0" w:color="BBBBBB"/>
@@ -11794,7 +11697,7 @@
         </w:tc>
         <w:tc>
           <w:tcPr>
-            <w:tcW w:w="2199" w:type="dxa"/>
+            <w:tcW w:w="2198" w:type="dxa"/>
             <w:tcBorders>
               <w:top w:val="single" w:sz="2" w:space="0" w:color="BBBBBB"/>
               <w:start w:val="single" w:sz="2" w:space="0" w:color="BBBBBB"/>
@@ -11825,7 +11728,7 @@
         </w:tc>
         <w:tc>
           <w:tcPr>
-            <w:tcW w:w="1680" w:type="dxa"/>
+            <w:tcW w:w="1681" w:type="dxa"/>
             <w:tcBorders>
               <w:top w:val="single" w:sz="2" w:space="0" w:color="BBBBBB"/>
               <w:start w:val="single" w:sz="2" w:space="0" w:color="BBBBBB"/>
@@ -11952,7 +11855,7 @@
         </w:tc>
         <w:tc>
           <w:tcPr>
-            <w:tcW w:w="2199" w:type="dxa"/>
+            <w:tcW w:w="2198" w:type="dxa"/>
             <w:tcBorders>
               <w:top w:val="single" w:sz="2" w:space="0" w:color="BBBBBB"/>
               <w:start w:val="single" w:sz="2" w:space="0" w:color="BBBBBB"/>
@@ -11983,7 +11886,7 @@
         </w:tc>
         <w:tc>
           <w:tcPr>
-            <w:tcW w:w="1680" w:type="dxa"/>
+            <w:tcW w:w="1681" w:type="dxa"/>
             <w:tcBorders>
               <w:top w:val="single" w:sz="2" w:space="0" w:color="BBBBBB"/>
               <w:start w:val="single" w:sz="2" w:space="0" w:color="BBBBBB"/>
@@ -12110,7 +12013,7 @@
         </w:tc>
         <w:tc>
           <w:tcPr>
-            <w:tcW w:w="2199" w:type="dxa"/>
+            <w:tcW w:w="2198" w:type="dxa"/>
             <w:tcBorders>
               <w:top w:val="single" w:sz="2" w:space="0" w:color="BBBBBB"/>
               <w:start w:val="single" w:sz="2" w:space="0" w:color="BBBBBB"/>
@@ -12141,7 +12044,7 @@
         </w:tc>
         <w:tc>
           <w:tcPr>
-            <w:tcW w:w="1680" w:type="dxa"/>
+            <w:tcW w:w="1681" w:type="dxa"/>
             <w:tcBorders>
               <w:top w:val="single" w:sz="2" w:space="0" w:color="BBBBBB"/>
               <w:start w:val="single" w:sz="2" w:space="0" w:color="BBBBBB"/>
@@ -12259,7 +12162,7 @@
       </w:pPr>
       <w:r>
         <w:rPr>
-          <w:rFonts w:eastAsia="Arial" w:cs="Arial" w:ascii="Arial" w:hAnsi="Arial"/>
+          <w:rFonts w:eastAsia="Arial" w:cs="Arial"/>
           <w:b/>
           <w:bCs/>
           <w:color w:val="FFFFFF"/>
@@ -12488,7 +12391,7 @@
       </w:pPr>
       <w:r>
         <w:rPr>
-          <w:rFonts w:eastAsia="Arial" w:cs="Arial" w:ascii="Arial" w:hAnsi="Arial"/>
+          <w:rFonts w:eastAsia="Arial" w:cs="Arial"/>
           <w:b/>
           <w:bCs/>
           <w:color w:val="1F4E79"/>
@@ -12879,7 +12782,7 @@
       </w:pPr>
       <w:r>
         <w:rPr>
-          <w:rFonts w:eastAsia="Arial" w:cs="Arial" w:ascii="Arial" w:hAnsi="Arial"/>
+          <w:rFonts w:eastAsia="Arial" w:cs="Arial"/>
           <w:b/>
           <w:bCs/>
           <w:color w:val="1F4E79"/>
@@ -13144,7 +13047,7 @@
       </w:pPr>
       <w:r>
         <w:rPr>
-          <w:rFonts w:eastAsia="Arial" w:cs="Arial" w:ascii="Arial" w:hAnsi="Arial"/>
+          <w:rFonts w:eastAsia="Arial" w:cs="Arial"/>
           <w:b/>
           <w:bCs/>
           <w:color w:val="FFFFFF"/>
@@ -13221,7 +13124,7 @@
       </w:pPr>
       <w:r>
         <w:rPr>
-          <w:rFonts w:eastAsia="Arial" w:cs="Arial" w:ascii="Arial" w:hAnsi="Arial"/>
+          <w:rFonts w:eastAsia="Arial" w:cs="Arial"/>
           <w:b/>
           <w:bCs/>
           <w:color w:val="1F4E79"/>
@@ -13435,7 +13338,7 @@
       </w:pPr>
       <w:r>
         <w:rPr>
-          <w:rFonts w:eastAsia="Arial" w:cs="Arial" w:ascii="Arial" w:hAnsi="Arial"/>
+          <w:rFonts w:eastAsia="Arial" w:cs="Arial"/>
           <w:b/>
           <w:bCs/>
           <w:color w:val="1F4E79"/>
@@ -13809,7 +13712,7 @@
       </w:pPr>
       <w:r>
         <w:rPr>
-          <w:rFonts w:eastAsia="Arial" w:cs="Arial" w:ascii="Arial" w:hAnsi="Arial"/>
+          <w:rFonts w:eastAsia="Arial" w:cs="Arial"/>
           <w:b/>
           <w:bCs/>
           <w:color w:val="FFFFFF"/>
@@ -13866,7 +13769,7 @@
       </w:pPr>
       <w:r>
         <w:rPr>
-          <w:rFonts w:eastAsia="Arial" w:cs="Arial" w:ascii="Arial" w:hAnsi="Arial"/>
+          <w:rFonts w:eastAsia="Arial" w:cs="Arial"/>
           <w:b/>
           <w:bCs/>
           <w:color w:val="1F4E79"/>
@@ -14468,7 +14371,7 @@
       </w:pPr>
       <w:r>
         <w:rPr>
-          <w:rFonts w:eastAsia="Arial" w:cs="Arial" w:ascii="Arial" w:hAnsi="Arial"/>
+          <w:rFonts w:eastAsia="Arial" w:cs="Arial"/>
           <w:b/>
           <w:bCs/>
           <w:color w:val="1F4E79"/>
@@ -15203,7 +15106,7 @@
       </w:pPr>
       <w:r>
         <w:rPr>
-          <w:rFonts w:eastAsia="Arial" w:cs="Arial" w:ascii="Arial" w:hAnsi="Arial"/>
+          <w:rFonts w:eastAsia="Arial" w:cs="Arial"/>
           <w:b/>
           <w:bCs/>
           <w:color w:val="1F4E79"/>
@@ -16064,7 +15967,7 @@
       </w:pPr>
       <w:r>
         <w:rPr>
-          <w:rFonts w:eastAsia="Arial" w:cs="Arial" w:ascii="Arial" w:hAnsi="Arial"/>
+          <w:rFonts w:eastAsia="Arial" w:cs="Arial"/>
           <w:b/>
           <w:bCs/>
           <w:color w:val="1F4E79"/>
@@ -16511,7 +16414,7 @@
       </w:pPr>
       <w:r>
         <w:rPr>
-          <w:rFonts w:eastAsia="Arial" w:cs="Arial" w:ascii="Arial" w:hAnsi="Arial"/>
+          <w:rFonts w:eastAsia="Arial" w:cs="Arial"/>
           <w:b/>
           <w:bCs/>
           <w:color w:val="1F4E79"/>
@@ -17654,7 +17557,12 @@
       </w:rPr>
     </w:pPr>
     <w:r>
-      <w:rPr/>
+      <w:rPr>
+        <w:rFonts w:eastAsia="Arial" w:cs="Arial"/>
+        <w:color w:val="888888"/>
+        <w:sz w:val="18"/>
+        <w:szCs w:val="18"/>
+      </w:rPr>
     </w:r>
   </w:p>
 </w:ftr>
@@ -17678,7 +17586,12 @@
       </w:rPr>
     </w:pPr>
     <w:r>
-      <w:rPr/>
+      <w:rPr>
+        <w:rFonts w:eastAsia="Arial" w:cs="Arial"/>
+        <w:color w:val="888888"/>
+        <w:sz w:val="18"/>
+        <w:szCs w:val="18"/>
+      </w:rPr>
     </w:r>
   </w:p>
 </w:ftr>
@@ -17777,6 +17690,7 @@
         </w:tabs>
         <w:ind w:start="1080" w:hanging="360"/>
       </w:pPr>
+      <w:rPr/>
     </w:lvl>
     <w:lvl w:ilvl="2">
       <w:start w:val="1"/>
@@ -17789,6 +17703,7 @@
         </w:tabs>
         <w:ind w:start="1440" w:hanging="360"/>
       </w:pPr>
+      <w:rPr/>
     </w:lvl>
     <w:lvl w:ilvl="3">
       <w:start w:val="1"/>
@@ -17801,6 +17716,7 @@
         </w:tabs>
         <w:ind w:start="1800" w:hanging="360"/>
       </w:pPr>
+      <w:rPr/>
     </w:lvl>
     <w:lvl w:ilvl="4">
       <w:start w:val="1"/>
@@ -17813,6 +17729,7 @@
         </w:tabs>
         <w:ind w:start="2160" w:hanging="360"/>
       </w:pPr>
+      <w:rPr/>
     </w:lvl>
     <w:lvl w:ilvl="5">
       <w:start w:val="1"/>
@@ -17825,6 +17742,7 @@
         </w:tabs>
         <w:ind w:start="2520" w:hanging="360"/>
       </w:pPr>
+      <w:rPr/>
     </w:lvl>
     <w:lvl w:ilvl="6">
       <w:start w:val="1"/>
@@ -17837,6 +17755,7 @@
         </w:tabs>
         <w:ind w:start="2880" w:hanging="360"/>
       </w:pPr>
+      <w:rPr/>
     </w:lvl>
     <w:lvl w:ilvl="7">
       <w:start w:val="1"/>
@@ -17849,6 +17768,7 @@
         </w:tabs>
         <w:ind w:start="3240" w:hanging="360"/>
       </w:pPr>
+      <w:rPr/>
     </w:lvl>
     <w:lvl w:ilvl="8">
       <w:start w:val="1"/>
@@ -17861,9 +17781,131 @@
         </w:tabs>
         <w:ind w:start="3600" w:hanging="360"/>
       </w:pPr>
+      <w:rPr/>
     </w:lvl>
   </w:abstractNum>
   <w:abstractNum w:abstractNumId="2">
+    <w:lvl w:ilvl="0">
+      <w:start w:val="1"/>
+      <w:numFmt w:val="bullet"/>
+      <w:lvlText w:val=""/>
+      <w:lvlJc w:val="start"/>
+      <w:pPr>
+        <w:tabs>
+          <w:tab w:val="num" w:pos="0"/>
+        </w:tabs>
+        <w:ind w:start="720" w:hanging="360"/>
+      </w:pPr>
+      <w:rPr>
+        <w:rFonts w:ascii="Symbol" w:hAnsi="Symbol" w:cs="Symbol" w:hint="default"/>
+      </w:rPr>
+    </w:lvl>
+    <w:lvl w:ilvl="1">
+      <w:start w:val="1"/>
+      <w:numFmt w:val="decimal"/>
+      <w:lvlText w:val="%2."/>
+      <w:lvlJc w:val="start"/>
+      <w:pPr>
+        <w:tabs>
+          <w:tab w:val="num" w:pos="1080"/>
+        </w:tabs>
+        <w:ind w:start="1080" w:hanging="360"/>
+      </w:pPr>
+      <w:rPr/>
+    </w:lvl>
+    <w:lvl w:ilvl="2">
+      <w:start w:val="1"/>
+      <w:numFmt w:val="decimal"/>
+      <w:lvlText w:val="%3."/>
+      <w:lvlJc w:val="start"/>
+      <w:pPr>
+        <w:tabs>
+          <w:tab w:val="num" w:pos="1440"/>
+        </w:tabs>
+        <w:ind w:start="1440" w:hanging="360"/>
+      </w:pPr>
+      <w:rPr/>
+    </w:lvl>
+    <w:lvl w:ilvl="3">
+      <w:start w:val="1"/>
+      <w:numFmt w:val="decimal"/>
+      <w:lvlText w:val="%4."/>
+      <w:lvlJc w:val="start"/>
+      <w:pPr>
+        <w:tabs>
+          <w:tab w:val="num" w:pos="1800"/>
+        </w:tabs>
+        <w:ind w:start="1800" w:hanging="360"/>
+      </w:pPr>
+      <w:rPr/>
+    </w:lvl>
+    <w:lvl w:ilvl="4">
+      <w:start w:val="1"/>
+      <w:numFmt w:val="decimal"/>
+      <w:lvlText w:val="%5."/>
+      <w:lvlJc w:val="start"/>
+      <w:pPr>
+        <w:tabs>
+          <w:tab w:val="num" w:pos="2160"/>
+        </w:tabs>
+        <w:ind w:start="2160" w:hanging="360"/>
+      </w:pPr>
+      <w:rPr/>
+    </w:lvl>
+    <w:lvl w:ilvl="5">
+      <w:start w:val="1"/>
+      <w:numFmt w:val="decimal"/>
+      <w:lvlText w:val="%6."/>
+      <w:lvlJc w:val="start"/>
+      <w:pPr>
+        <w:tabs>
+          <w:tab w:val="num" w:pos="2520"/>
+        </w:tabs>
+        <w:ind w:start="2520" w:hanging="360"/>
+      </w:pPr>
+      <w:rPr/>
+    </w:lvl>
+    <w:lvl w:ilvl="6">
+      <w:start w:val="1"/>
+      <w:numFmt w:val="decimal"/>
+      <w:lvlText w:val="%7."/>
+      <w:lvlJc w:val="start"/>
+      <w:pPr>
+        <w:tabs>
+          <w:tab w:val="num" w:pos="2880"/>
+        </w:tabs>
+        <w:ind w:start="2880" w:hanging="360"/>
+      </w:pPr>
+      <w:rPr/>
+    </w:lvl>
+    <w:lvl w:ilvl="7">
+      <w:start w:val="1"/>
+      <w:numFmt w:val="decimal"/>
+      <w:lvlText w:val="%8."/>
+      <w:lvlJc w:val="start"/>
+      <w:pPr>
+        <w:tabs>
+          <w:tab w:val="num" w:pos="3240"/>
+        </w:tabs>
+        <w:ind w:start="3240" w:hanging="360"/>
+      </w:pPr>
+      <w:rPr/>
+    </w:lvl>
+    <w:lvl w:ilvl="8">
+      <w:start w:val="1"/>
+      <w:numFmt w:val="decimal"/>
+      <w:lvlText w:val="%9."/>
+      <w:lvlJc w:val="start"/>
+      <w:pPr>
+        <w:tabs>
+          <w:tab w:val="num" w:pos="3600"/>
+        </w:tabs>
+        <w:ind w:start="3600" w:hanging="360"/>
+      </w:pPr>
+      <w:rPr/>
+    </w:lvl>
+  </w:abstractNum>
+  <w:abstractNum w:abstractNumId="3">
     <w:lvl w:ilvl="0">
       <w:start w:val="1"/>
       <w:numFmt w:val="none"/>
@@ -17989,7 +18031,10 @@
     <w:abstractNumId w:val="2"/>
   </w:num>
   <w:num w:numId="3">
-    <w:abstractNumId w:val="1"/>
+    <w:abstractNumId w:val="3"/>
+  </w:num>
+  <w:num w:numId="4">
+    <w:abstractNumId w:val="2"/>
     <w:lvlOverride w:ilvl="0">
       <w:startOverride w:val="1"/>
     </w:lvlOverride>
@@ -18019,6 +18064,7 @@
     <w:qFormat/>
     <w:pPr>
       <w:widowControl/>
+      <w:suppressAutoHyphens w:val="true"/>
       <w:bidi w:val="0"/>
       <w:spacing w:before="0" w:after="0"/>
       <w:jc w:val="start"/>
@@ -18121,11 +18167,18 @@
       <w:u w:val="single"/>
     </w:rPr>
   </w:style>
-  <w:style w:type="character" w:styleId="FootnoteCharacters">
-    <w:name w:val="Footnote Characters"/>
+  <w:style w:type="character" w:styleId="FootnoteCharactersuser">
+    <w:name w:val="Footnote Characters (user)"/>
     <w:uiPriority w:val="99"/>
     <w:semiHidden/>
     <w:unhideWhenUsed/>
+    <w:qFormat/>
+    <w:rPr>
+      <w:vertAlign w:val="superscript"/>
+    </w:rPr>
+  </w:style>
+  <w:style w:type="character" w:styleId="FootnoteCharacters">
+    <w:name w:val="Footnote Characters"/>
     <w:qFormat/>
     <w:rPr>
       <w:vertAlign w:val="superscript"/>
@@ -18149,11 +18202,18 @@
       <w:szCs w:val="20"/>
     </w:rPr>
   </w:style>
-  <w:style w:type="character" w:styleId="EndnoteCharacters">
-    <w:name w:val="Endnote Characters"/>
+  <w:style w:type="character" w:styleId="EndnoteCharactersuser">
+    <w:name w:val="Endnote Characters (user)"/>
     <w:uiPriority w:val="99"/>
     <w:semiHidden/>
     <w:unhideWhenUsed/>
+    <w:qFormat/>
+    <w:rPr>
+      <w:vertAlign w:val="superscript"/>
+    </w:rPr>
+  </w:style>
+  <w:style w:type="character" w:styleId="EndnoteCharacters">
+    <w:name w:val="Endnote Characters"/>
     <w:qFormat/>
     <w:rPr>
       <w:vertAlign w:val="superscript"/>
@@ -18258,6 +18318,7 @@
     <w:qFormat/>
     <w:pPr>
       <w:widowControl/>
+      <w:suppressAutoHyphens w:val="true"/>
       <w:bidi w:val="0"/>
       <w:spacing w:before="0" w:after="0"/>
       <w:jc w:val="start"/>
@@ -18278,6 +18339,7 @@
     <w:qFormat/>
     <w:pPr>
       <w:widowControl/>
+      <w:suppressAutoHyphens w:val="true"/>
       <w:bidi w:val="0"/>
       <w:spacing w:before="0" w:after="0"/>
       <w:jc w:val="start"/>

</xml_diff>